<commit_message>
autodist: pick up dist-ID remaps on running screens
Remapping a kiosk_dist_id to a different store account in the DB had no
effect on screens holding a valid session — session reuse plus refresh
tokens kept the old account's QR alive forever. The kiosk page now
re-signs-in from its stored dist ID on load and hourly
(refreshDistIdentity in autodist/config.js), replacing the session with
whatever account the backend currently maps; on change it refetches the
QR, on 401 (revoked ID) it drops the session and shows the not-active
message, and on network failure it keeps the working session. Config
cache-buster bumped to autodist2. Deployment guide updated to document
both remap styles.

Co-Authored-By: Claude Fable 5 <noreply@anthropic.com>
</commit_message>
<xml_diff>
--- a/DEPLOYMENT.docx
+++ b/DEPLOYMENT.docx
@@ -2912,7 +2912,15 @@
         <w:pStyle w:val="ListBullet"/>
       </w:pPr>
       <w:r>
-        <w:t xml:space="preserve">Remapping a screen to a different store = point its </w:t>
+        <w:t>Remapping a screen to a different store, either way works:</w:t>
+      </w:r>
+    </w:p>
+    <w:p>
+      <w:pPr>
+        <w:pStyle w:val="ListBullet2"/>
+      </w:pPr>
+      <w:r>
+        <w:t xml:space="preserve">Change the </w:t>
       </w:r>
       <w:r>
         <w:rPr>
@@ -2923,12 +2931,75 @@
         <w:t>dist</w:t>
       </w:r>
       <w:r>
-        <w:t xml:space="preserve"> at the new ID</w:t>
+        <w:t xml:space="preserve"> in the URL — a different dist always forces a fresh</w:t>
       </w:r>
     </w:p>
     <w:p>
       <w:r>
-        <w:t xml:space="preserve">(a different dist in the URL always forces a fresh sign-in); revoking a venue = </w:t>
+        <w:t>sign-in on the next page load.</w:t>
+      </w:r>
+    </w:p>
+    <w:p>
+      <w:pPr>
+        <w:pStyle w:val="ListBullet2"/>
+      </w:pPr>
+      <w:r>
+        <w:t>Keep the same dist ID and move it to another account in the DB</w:t>
+      </w:r>
+    </w:p>
+    <w:p>
+      <w:r>
+        <w:t>(</w:t>
+      </w:r>
+      <w:r>
+        <w:rPr>
+          <w:rFonts w:ascii="Consolas" w:hAnsi="Consolas"/>
+          <w:color w:val="5A8A00"/>
+          <w:sz w:val="19"/>
+        </w:rPr>
+        <w:t>SET kiosk_dist_id</w:t>
+      </w:r>
+      <w:r>
+        <w:t xml:space="preserve"> on the new store, NULL on the old). Running screens pick this up on their next page reload and at most within </w:t>
+      </w:r>
+      <w:r>
+        <w:rPr>
+          <w:b/>
+        </w:rPr>
+        <w:t>1 hour</w:t>
+      </w:r>
+      <w:r>
+        <w:t xml:space="preserve"> — the kiosk page re-signs-in from its stored dist ID on load and hourly (</w:t>
+      </w:r>
+      <w:r>
+        <w:rPr>
+          <w:rFonts w:ascii="Consolas" w:hAnsi="Consolas"/>
+          <w:color w:val="5A8A00"/>
+          <w:sz w:val="19"/>
+        </w:rPr>
+        <w:t>refreshDistIdentity()</w:t>
+      </w:r>
+      <w:r>
+        <w:t xml:space="preserve"> in </w:t>
+      </w:r>
+      <w:r>
+        <w:rPr>
+          <w:rFonts w:ascii="Consolas" w:hAnsi="Consolas"/>
+          <w:color w:val="5A8A00"/>
+          <w:sz w:val="19"/>
+        </w:rPr>
+        <w:t>web/autodist/config.js</w:t>
+      </w:r>
+      <w:r>
+        <w:t>) precisely so DB remaps reach screens nobody touches.</w:t>
+      </w:r>
+    </w:p>
+    <w:p>
+      <w:pPr>
+        <w:pStyle w:val="ListBullet"/>
+      </w:pPr>
+      <w:r>
+        <w:t xml:space="preserve">Revoking a venue = </w:t>
       </w:r>
       <w:r>
         <w:rPr>
@@ -2939,7 +3010,12 @@
         <w:t>SET kiosk_dist_id = NULL</w:t>
       </w:r>
       <w:r>
-        <w:t>.</w:t>
+        <w:t xml:space="preserve"> — the hourly re-sign-in gets</w:t>
+      </w:r>
+    </w:p>
+    <w:p>
+      <w:r>
+        <w:t>a 401, the session is dropped, and the screen shows "This kiosk link is not active" instead of a stale QR.</w:t>
       </w:r>
     </w:p>
     <w:p>

</xml_diff>

<commit_message>
autodist: check for dist-ID remaps every 15 minutes instead of hourly
Remaps are rare but should land fast; the check is one successful login
per screen per 15 min (never rate-limited, negligible load), so the
tighter interval is all upside. Docs updated to match.

Co-Authored-By: Claude Fable 5 <noreply@anthropic.com>
</commit_message>
<xml_diff>
--- a/DEPLOYMENT.docx
+++ b/DEPLOYMENT.docx
@@ -2966,10 +2966,10 @@
         <w:rPr>
           <w:b/>
         </w:rPr>
-        <w:t>1 hour</w:t>
-      </w:r>
-      <w:r>
-        <w:t xml:space="preserve"> — the kiosk page re-signs-in from its stored dist ID on load and hourly (</w:t>
+        <w:t>15 minutes</w:t>
+      </w:r>
+      <w:r>
+        <w:t xml:space="preserve"> — the kiosk page re-signs-in from its stored dist ID on load and every 15 minutes (</w:t>
       </w:r>
       <w:r>
         <w:rPr>
@@ -3010,7 +3010,7 @@
         <w:t>SET kiosk_dist_id = NULL</w:t>
       </w:r>
       <w:r>
-        <w:t xml:space="preserve"> — the hourly re-sign-in gets</w:t>
+        <w:t xml:space="preserve"> — the periodic re-sign-in gets</w:t>
       </w:r>
     </w:p>
     <w:p>

</xml_diff>